<commit_message>
Add new skill templates and automation scripts
</commit_message>
<xml_diff>
--- a/giai-ngan-ocb/templates/1. KUNN_template_NGOAITE.docx
+++ b/giai-ngan-ocb/templates/1. KUNN_template_NGOAITE.docx
@@ -854,67 +854,6 @@
                 <w:color w:val="000000" w:themeColor="text1"/>
               </w:rPr>
             </w:pPr>
-            <w:r>
-              <w:rPr>
-                <w:rFonts w:ascii="Arial" w:eastAsia="Times New Roman" w:hAnsi="Arial" w:cs="Arial"/>
-                <w:color w:val="000000" w:themeColor="text1"/>
-              </w:rPr>
-              <w:t>852,527,200</w:t>
-            </w:r>
-            <w:r>
-              <w:rPr>
-                <w:rFonts w:ascii="Arial" w:eastAsia="Times New Roman" w:hAnsi="Arial" w:cs="Arial"/>
-                <w:color w:val="000000" w:themeColor="text1"/>
-              </w:rPr>
-              <w:t xml:space="preserve"> </w:t>
-            </w:r>
-            <w:r>
-              <w:rPr>
-                <w:rFonts w:ascii="Arial" w:eastAsia="Times New Roman" w:hAnsi="Arial" w:cs="Arial"/>
-                <w:color w:val="000000" w:themeColor="text1"/>
-              </w:rPr>
-              <w:t xml:space="preserve">đồng </w:t>
-            </w:r>
-          </w:p>
-          <w:p>
-            <w:pPr>
-              <w:spacing w:before="120" w:after="120" w:line="320" w:lineRule="atLeast"/>
-              <w:rPr>
-                <w:rFonts w:ascii="Arial" w:eastAsia="Times New Roman" w:hAnsi="Arial" w:cs="Arial"/>
-                <w:color w:val="000000" w:themeColor="text1"/>
-              </w:rPr>
-            </w:pPr>
-            <w:r>
-              <w:rPr>
-                <w:rFonts w:ascii="Arial" w:eastAsia="Times New Roman" w:hAnsi="Arial" w:cs="Arial"/>
-                <w:color w:val="000000" w:themeColor="text1"/>
-              </w:rPr>
-              <w:t>(Bằng chữ</w:t>
-            </w:r>
-            <w:r>
-              <w:rPr>
-                <w:rFonts w:ascii="Arial" w:eastAsia="Times New Roman" w:hAnsi="Arial" w:cs="Arial"/>
-                <w:color w:val="000000" w:themeColor="text1"/>
-              </w:rPr>
-              <w:t>:</w:t>
-            </w:r>
-            <w:r>
-              <w:t xml:space="preserve"> </w:t>
-            </w:r>
-            <w:r>
-              <w:rPr>
-                <w:rFonts w:ascii="Arial" w:eastAsia="Times New Roman" w:hAnsi="Arial" w:cs="Arial"/>
-                <w:color w:val="000000" w:themeColor="text1"/>
-              </w:rPr>
-              <w:t>Tám trăm năm mươi hai triệu năm trăm hai mươi bảy ngàn hai trăm đồng chẵn</w:t>
-            </w:r>
-            <w:r>
-              <w:rPr>
-                <w:rFonts w:ascii="Arial" w:eastAsia="Times New Roman" w:hAnsi="Arial" w:cs="Arial"/>
-                <w:color w:val="000000" w:themeColor="text1"/>
-              </w:rPr>
-              <w:t>)</w:t>
-            </w:r>
           </w:p>
         </w:tc>
       </w:tr>
@@ -1453,25 +1392,33 @@
                 <w:i/>
                 <w:color w:val="000000" w:themeColor="text1"/>
               </w:rPr>
+              <w:t>Thời gian ân hạn là khoảng thời gian Bên được cấp tín dụng</w:t>
+            </w:r>
+            <w:r>
+              <w:rPr>
+                <w:rFonts w:ascii="Arial" w:hAnsi="Arial" w:cs="Arial"/>
+                <w:i/>
+                <w:color w:val="000000" w:themeColor="text1"/>
+                <w:lang w:val="vi-VN"/>
+              </w:rPr>
+              <w:t xml:space="preserve"> </w:t>
+            </w:r>
+            <w:r>
+              <w:rPr>
+                <w:rFonts w:ascii="Arial" w:hAnsi="Arial" w:cs="Arial"/>
+                <w:i/>
+                <w:color w:val="000000" w:themeColor="text1"/>
+              </w:rPr>
+              <w:t xml:space="preserve">chưa trả vốn gốc và/hoặc lãi vay nhưng lãi vẫn được tính theo quy định tại Hợp Đồng Cấp Tín </w:t>
+            </w:r>
+            <w:r>
+              <w:rPr>
+                <w:rFonts w:ascii="Arial" w:hAnsi="Arial" w:cs="Arial"/>
+                <w:i/>
+                <w:color w:val="000000" w:themeColor="text1"/>
+              </w:rPr>
               <w:lastRenderedPageBreak/>
-              <w:t>Thời gian ân hạn là khoảng thời gian Bên được cấp tín dụng</w:t>
-            </w:r>
-            <w:r>
-              <w:rPr>
-                <w:rFonts w:ascii="Arial" w:hAnsi="Arial" w:cs="Arial"/>
-                <w:i/>
-                <w:color w:val="000000" w:themeColor="text1"/>
-                <w:lang w:val="vi-VN"/>
-              </w:rPr>
-              <w:t xml:space="preserve"> </w:t>
-            </w:r>
-            <w:r>
-              <w:rPr>
-                <w:rFonts w:ascii="Arial" w:hAnsi="Arial" w:cs="Arial"/>
-                <w:i/>
-                <w:color w:val="000000" w:themeColor="text1"/>
-              </w:rPr>
-              <w:t>chưa trả vốn gốc và/hoặc lãi vay nhưng lãi vẫn được tính theo quy định tại Hợp Đồng Cấp Tín Dụng/</w:t>
+              <w:t>Dụng/</w:t>
             </w:r>
             <w:r>
               <w:rPr>
@@ -2797,7 +2744,6 @@
                 <w:sz w:val="22"/>
                 <w:szCs w:val="22"/>
               </w:rPr>
-              <w:lastRenderedPageBreak/>
               <w:t>Phương án sử dụng vốn và nguồn trả nợ</w:t>
             </w:r>
           </w:p>
@@ -2899,6 +2845,7 @@
                 <w:color w:val="000000" w:themeColor="text1"/>
                 <w:lang w:val="vi-VN" w:eastAsia="ja-JP"/>
               </w:rPr>
+              <w:lastRenderedPageBreak/>
               <w:t xml:space="preserve">Kế hoạch này đã được OCB xem xét, đánh giá và phê duyệt cấp tín dụng, làm cơ sở để hai bên tiến tới ký kết </w:t>
             </w:r>
             <w:r>
@@ -2969,6 +2916,7 @@
                 <w:sz w:val="22"/>
                 <w:szCs w:val="22"/>
               </w:rPr>
+              <w:lastRenderedPageBreak/>
               <w:t>Các thỏa thuận/ cam kết khác (nếu có)</w:t>
             </w:r>
           </w:p>
@@ -3497,17 +3445,7 @@
           <w:sz w:val="22"/>
           <w:lang w:eastAsia="ja-JP"/>
         </w:rPr>
-        <w:t xml:space="preserve">tại phần dưới đây về số tiền, </w:t>
-      </w:r>
-      <w:r>
-        <w:rPr>
-          <w:rFonts w:ascii="Arial" w:hAnsi="Arial" w:cs="Arial"/>
-          <w:color w:val="000000" w:themeColor="text1"/>
-          <w:sz w:val="22"/>
-          <w:lang w:eastAsia="ja-JP"/>
-        </w:rPr>
-        <w:lastRenderedPageBreak/>
-        <w:t xml:space="preserve">lãi suất, thời hạn và các nội dung khác </w:t>
+        <w:t xml:space="preserve">tại phần dưới đây về số tiền, lãi suất, thời hạn và các nội dung khác </w:t>
       </w:r>
       <w:r>
         <w:rPr>
@@ -3618,7 +3556,17 @@
           <w:sz w:val="22"/>
           <w:lang w:eastAsia="ja-JP"/>
         </w:rPr>
-        <w:t>Chúng tôi xác nhận đã được OCB cung cấp đầy đủ thông tin về: lãi suất cho vay; nguyên tắc và các yếu tố xác định, thời điểm xác định lãi suất cho vay đối với trường hợp áp dụng lãi suất cho vay có điều chỉnh; lãi suất áp dụng đối với dư nợ gốc bị quá hạn; lãi suất áp dụng đối với lãi chậm trả; phương pháp tính lãi tiền vay; loại phí và mức phí áp dụng đối với khoản vay; các tiêu chí xác định Bên được cấp tín dụng vay vốn theo lãi suất cho vay không vượt quá mức lãi suất cho vay tối đa theo quy định pháp luật; nội dung Hợp đồng/chứng từ, điều kiện giao dịch liên quan đến khoản vay.</w:t>
+        <w:t xml:space="preserve">Chúng tôi xác nhận đã được OCB cung cấp đầy đủ thông tin về: lãi suất cho vay; nguyên tắc và các yếu tố xác định, thời điểm xác định lãi suất cho vay đối với trường hợp áp dụng lãi suất </w:t>
+      </w:r>
+      <w:r>
+        <w:rPr>
+          <w:rFonts w:ascii="Arial" w:hAnsi="Arial" w:cs="Arial"/>
+          <w:color w:val="000000" w:themeColor="text1"/>
+          <w:sz w:val="22"/>
+          <w:lang w:eastAsia="ja-JP"/>
+        </w:rPr>
+        <w:lastRenderedPageBreak/>
+        <w:t>cho vay có điều chỉnh; lãi suất áp dụng đối với dư nợ gốc bị quá hạn; lãi suất áp dụng đối với lãi chậm trả; phương pháp tính lãi tiền vay; loại phí và mức phí áp dụng đối với khoản vay; các tiêu chí xác định Bên được cấp tín dụng vay vốn theo lãi suất cho vay không vượt quá mức lãi suất cho vay tối đa theo quy định pháp luật; nội dung Hợp đồng/chứng từ, điều kiện giao dịch liên quan đến khoản vay.</w:t>
       </w:r>
     </w:p>
     <w:p>
@@ -5697,7 +5645,7 @@
         <v:path o:extrusionok="f" gradientshapeok="t" o:connecttype="rect"/>
         <o:lock v:ext="edit" aspectratio="t"/>
       </v:shapetype>
-      <v:shape id="_x0000_i1041" type="#_x0000_t75" style="width:11.2pt;height:11.2pt" o:bullet="t">
+      <v:shape id="_x0000_i1025" type="#_x0000_t75" style="width:11.4pt;height:11.4pt" o:bullet="t">
         <v:imagedata r:id="rId1" o:title="msoCFB3"/>
       </v:shape>
     </w:pict>
@@ -9618,6 +9566,17 @@
 </file>
 
 <file path=customXml/item1.xml><?xml version="1.0" encoding="utf-8"?>
+<p:properties xmlns:p="http://schemas.microsoft.com/office/2006/metadata/properties" xmlns:xsi="http://www.w3.org/2001/XMLSchema-instance" xmlns:pc="http://schemas.microsoft.com/office/infopath/2007/PartnerControls">
+  <documentManagement>
+    <lcf76f155ced4ddcb4097134ff3c332f xmlns="97f69d50-4ef3-4856-934d-57dbdf4f6ea5">
+      <Terms xmlns="http://schemas.microsoft.com/office/infopath/2007/PartnerControls"/>
+    </lcf76f155ced4ddcb4097134ff3c332f>
+    <TaxCatchAll xmlns="184e74be-7873-4698-965f-b07e52c33735" xsi:nil="true"/>
+  </documentManagement>
+</p:properties>
+</file>
+
+<file path=customXml/item2.xml><?xml version="1.0" encoding="utf-8"?>
 <ct:contentTypeSchema xmlns:ct="http://schemas.microsoft.com/office/2006/metadata/contentType" xmlns:ma="http://schemas.microsoft.com/office/2006/metadata/properties/metaAttributes" ct:_="" ma:_="" ma:contentTypeName="Document" ma:contentTypeID="0x010100F5A9F26C2B58E341AE5B418E1E6FA4A5" ma:contentTypeVersion="19" ma:contentTypeDescription="Create a new document." ma:contentTypeScope="" ma:versionID="b49a56b4ad1b615b2f944af745f516ae">
   <xsd:schema xmlns:xsd="http://www.w3.org/2001/XMLSchema" xmlns:xs="http://www.w3.org/2001/XMLSchema" xmlns:p="http://schemas.microsoft.com/office/2006/metadata/properties" xmlns:ns2="97f69d50-4ef3-4856-934d-57dbdf4f6ea5" xmlns:ns3="184e74be-7873-4698-965f-b07e52c33735" targetNamespace="http://schemas.microsoft.com/office/2006/metadata/properties" ma:root="true" ma:fieldsID="78b29b735fa32d20875ae1ff3692676b" ns2:_="" ns3:_="">
     <xsd:import namespace="97f69d50-4ef3-4856-934d-57dbdf4f6ea5"/>
@@ -9878,22 +9837,7 @@
 </ct:contentTypeSchema>
 </file>
 
-<file path=customXml/item2.xml><?xml version="1.0" encoding="utf-8"?>
-<p:properties xmlns:p="http://schemas.microsoft.com/office/2006/metadata/properties" xmlns:xsi="http://www.w3.org/2001/XMLSchema-instance" xmlns:pc="http://schemas.microsoft.com/office/infopath/2007/PartnerControls">
-  <documentManagement>
-    <lcf76f155ced4ddcb4097134ff3c332f xmlns="97f69d50-4ef3-4856-934d-57dbdf4f6ea5">
-      <Terms xmlns="http://schemas.microsoft.com/office/infopath/2007/PartnerControls"/>
-    </lcf76f155ced4ddcb4097134ff3c332f>
-    <TaxCatchAll xmlns="184e74be-7873-4698-965f-b07e52c33735" xsi:nil="true"/>
-  </documentManagement>
-</p:properties>
-</file>
-
 <file path=customXml/item3.xml><?xml version="1.0" encoding="utf-8"?>
-<b:Sources xmlns:b="http://schemas.openxmlformats.org/officeDocument/2006/bibliography" xmlns="http://schemas.openxmlformats.org/officeDocument/2006/bibliography" SelectedStyle="\APASixthEditionOfficeOnline.xsl" StyleName="APA" Version="6"/>
-</file>
-
-<file path=customXml/item4.xml><?xml version="1.0" encoding="utf-8"?>
 <?mso-contentType ?>
 <FormTemplates xmlns="http://schemas.microsoft.com/sharepoint/v3/contenttype/forms">
   <Display>DocumentLibraryForm</Display>
@@ -9902,11 +9846,11 @@
 </FormTemplates>
 </file>
 
-<file path=customXml/itemProps1.xml><?xml version="1.0" encoding="utf-8"?>
-<ds:datastoreItem xmlns:ds="http://schemas.openxmlformats.org/officeDocument/2006/customXml" ds:itemID="{B4BD5103-DFBC-49C8-957C-A1F387C567FA}"/>
+<file path=customXml/item4.xml><?xml version="1.0" encoding="utf-8"?>
+<b:Sources xmlns:b="http://schemas.openxmlformats.org/officeDocument/2006/bibliography" xmlns="http://schemas.openxmlformats.org/officeDocument/2006/bibliography" SelectedStyle="\APASixthEditionOfficeOnline.xsl" StyleName="APA" Version="6"/>
 </file>
 
-<file path=customXml/itemProps2.xml><?xml version="1.0" encoding="utf-8"?>
+<file path=customXml/itemProps1.xml><?xml version="1.0" encoding="utf-8"?>
 <ds:datastoreItem xmlns:ds="http://schemas.openxmlformats.org/officeDocument/2006/customXml" ds:itemID="{7D6262B7-86E3-4B91-B88A-28F685995170}">
   <ds:schemaRefs>
     <ds:schemaRef ds:uri="http://schemas.microsoft.com/office/2006/metadata/properties"/>
@@ -9917,18 +9861,37 @@
 </ds:datastoreItem>
 </file>
 
+<file path=customXml/itemProps2.xml><?xml version="1.0" encoding="utf-8"?>
+<ds:datastoreItem xmlns:ds="http://schemas.openxmlformats.org/officeDocument/2006/customXml" ds:itemID="{B4BD5103-DFBC-49C8-957C-A1F387C567FA}">
+  <ds:schemaRefs>
+    <ds:schemaRef ds:uri="http://schemas.microsoft.com/office/2006/metadata/contentType"/>
+    <ds:schemaRef ds:uri="http://schemas.microsoft.com/office/2006/metadata/properties/metaAttributes"/>
+    <ds:schemaRef ds:uri="http://www.w3.org/2001/XMLSchema"/>
+    <ds:schemaRef ds:uri="http://schemas.microsoft.com/office/2006/metadata/properties"/>
+    <ds:schemaRef ds:uri="97f69d50-4ef3-4856-934d-57dbdf4f6ea5"/>
+    <ds:schemaRef ds:uri="184e74be-7873-4698-965f-b07e52c33735"/>
+    <ds:schemaRef ds:uri="http://schemas.microsoft.com/office/2006/documentManagement/types"/>
+    <ds:schemaRef ds:uri="http://schemas.microsoft.com/office/infopath/2007/PartnerControls"/>
+    <ds:schemaRef ds:uri="http://schemas.openxmlformats.org/package/2006/metadata/core-properties"/>
+    <ds:schemaRef ds:uri="http://purl.org/dc/elements/1.1/"/>
+    <ds:schemaRef ds:uri="http://purl.org/dc/terms/"/>
+    <ds:schemaRef ds:uri="http://schemas.microsoft.com/internal/obd"/>
+  </ds:schemaRefs>
+</ds:datastoreItem>
+</file>
+
 <file path=customXml/itemProps3.xml><?xml version="1.0" encoding="utf-8"?>
+<ds:datastoreItem xmlns:ds="http://schemas.openxmlformats.org/officeDocument/2006/customXml" ds:itemID="{E02C2ADC-131F-47B7-8EE2-DB02A0269043}">
+  <ds:schemaRefs>
+    <ds:schemaRef ds:uri="http://schemas.microsoft.com/sharepoint/v3/contenttype/forms"/>
+  </ds:schemaRefs>
+</ds:datastoreItem>
+</file>
+
+<file path=customXml/itemProps4.xml><?xml version="1.0" encoding="utf-8"?>
 <ds:datastoreItem xmlns:ds="http://schemas.openxmlformats.org/officeDocument/2006/customXml" ds:itemID="{34CC4F09-C0CC-4263-809D-327AC2607E20}">
   <ds:schemaRefs>
     <ds:schemaRef ds:uri="http://schemas.openxmlformats.org/officeDocument/2006/bibliography"/>
   </ds:schemaRefs>
 </ds:datastoreItem>
-</file>
-
-<file path=customXml/itemProps4.xml><?xml version="1.0" encoding="utf-8"?>
-<ds:datastoreItem xmlns:ds="http://schemas.openxmlformats.org/officeDocument/2006/customXml" ds:itemID="{E02C2ADC-131F-47B7-8EE2-DB02A0269043}">
-  <ds:schemaRefs>
-    <ds:schemaRef ds:uri="http://schemas.microsoft.com/sharepoint/v3/contenttype/forms"/>
-  </ds:schemaRefs>
-</ds:datastoreItem>
 </file>
</xml_diff>